<commit_message>
fix: update duplicate records interpretation and remove unsupported workload claim
</commit_message>
<xml_diff>
--- a/report/Week_5_Comprehensive_Data_Science_Project.docx
+++ b/report/Week_5_Comprehensive_Data_Science_Project.docx
@@ -817,7 +817,7 @@
                 <w:color w:val="1E293B"/>
                 <w:sz w:val="17"/>
               </w:rPr>
-              <w:t>240 (retained distinct batches)</w:t>
+              <w:t>240 (retained; unverified batch origin)</w:t>
             </w:r>
           </w:p>
         </w:tc>
@@ -859,7 +859,7 @@
           <w:color w:val="1E293B"/>
           <w:sz w:val="21"/>
         </w:rPr>
-        <w:t>Data hygiene protocols verified complete integrity across all 1,599 observations, with 0 missing values or structural anomalies detected. An inspection of the raw records identified 240 instances sharing identical physicochemical measurements across all 11 features. Consistent with domain literature (Cortez et al., 2009), these records reflect distinct production batches exhibiting identical analytical profiles and were consequently retained in the analytical corpus.</w:t>
+        <w:t>Data hygiene protocols verified complete integrity across all 1,599 observations, with 0 missing values or structural anomalies detected. The dataset contains 240 duplicate feature/label records. Because the available dataset does not provide a unique production-batch identifier, these records cannot be independently verified as repeated measurements from the same production batch. Therefore, the duplicate records were retained rather than removed, and this decision is acknowledged as a limitation of the dataset.</w:t>
       </w:r>
     </w:p>
     <w:p>
@@ -11006,7 +11006,7 @@
         </w:rPr>
         <w:t>DATA FINDING: In holdout test evaluations, Random Forest achieved 74.69% accuracy and 0.8571 ROC-AUC, correctly identifying 74.27% of Good wines and 75.17% of Standard wines.</w:t>
         <w:br/>
-        <w:t>INTERPRETATION: Physicochemical profiling provides substantial automated discriminatory power, but exhibits a ~25% error rate on borderline production batches.</w:t>
+        <w:t>INTERPRETATION: Physicochemical profiling provides substantial automated discriminatory power, but exhibits a ~25% error rate on borderline wine samples.</w:t>
         <w:br/>
         <w:t>STAKEHOLDER IMPLICATION: Direct automated release of wine without human sensory evaluation introduces unacceptable brand risk, but comprehensive manual tasting of all batches is operationally inefficient.</w:t>
         <w:br/>
@@ -11137,7 +11137,7 @@
           <w:color w:val="1E293B"/>
           <w:sz w:val="21"/>
         </w:rPr>
-        <w:t>1. Laboratory Throughput Optimization: Implementing model-assisted triage allows wineries to reduce expert tasting workload by an estimated 40–50%, focusing expensive sommelier hours on ambiguous and high-value reserve batches.</w:t>
+        <w:t>1. Laboratory Throughput Optimization: Model-assisted triage could potentially reduce the number of samples requiring immediate expert review by prioritizing cases according to predicted quality and model confidence. However, the present study did not measure operational workload reduction, so the magnitude of any efficiency improvement should be evaluated through a prospective validation study.</w:t>
       </w:r>
     </w:p>
     <w:p>

</xml_diff>